<commit_message>
Expand RELL deep-dive: add 800V transition, NoMIS Power and Gotion partnerships
- New 6.3 subsection on the 800V HVDC transition and RELL's SiC positioning
  (Navitas GeneSiC + new NoMIS Power line spanning ~650V-10kV)
- New 6.4 partnership spotlight table comparing the Gotion BESS (May 13) and
  NoMIS Power SiC (May 20, 2026) technology partnerships
- Updated AI-tailwind tiers, catalysts table, scorecard, exec summary and
  sources to reflect both deals and the 800V power-electronics theme

https://claude.ai/code/session_01D8PZeMsBNVAF4FYo4XLscN
</commit_message>
<xml_diff>
--- a/RELL_Deep_Dive_Bull_Bear_AI.docx
+++ b/RELL_Deep_Dive_Bull_Bear_AI.docx
@@ -43,7 +43,7 @@
         </w:rPr>
         <w:t>An Ultra Deep Dive: Bull Case, Bear Case, Near-Term Catalysts,</w:t>
         <w:br/>
-        <w:t>and the AI Secular Tailwind</w:t>
+        <w:t>and the AI / 800V Power Secular Tailwind</w:t>
       </w:r>
     </w:p>
     <w:p>
@@ -481,6 +481,39 @@
                 <w:b w:val="0"/>
                 <w:sz w:val="19"/>
               </w:rPr>
+              <w:t>Recent strategic deals</w:t>
+            </w:r>
+          </w:p>
+        </w:tc>
+        <w:tc>
+          <w:tcPr>
+            <w:tcW w:type="dxa" w:w="5904"/>
+            <w:shd w:val="clear" w:color="auto" w:fill="F0F3F7"/>
+          </w:tcPr>
+          <w:p>
+            <w:r/>
+            <w:r>
+              <w:rPr>
+                <w:b w:val="0"/>
+                <w:sz w:val="19"/>
+              </w:rPr>
+              <w:t>Gotion BESS (May 13) and NoMIS Power SiC (May 20, 2026)</w:t>
+            </w:r>
+          </w:p>
+        </w:tc>
+      </w:tr>
+      <w:tr>
+        <w:tc>
+          <w:tcPr>
+            <w:tcW w:type="dxa" w:w="3456"/>
+          </w:tcPr>
+          <w:p>
+            <w:r/>
+            <w:r>
+              <w:rPr>
+                <w:b w:val="0"/>
+                <w:sz w:val="19"/>
+              </w:rPr>
               <w:t>Sell-side rating</w:t>
             </w:r>
           </w:p>
@@ -488,7 +521,6 @@
         <w:tc>
           <w:tcPr>
             <w:tcW w:type="dxa" w:w="5904"/>
-            <w:shd w:val="clear" w:color="auto" w:fill="F0F3F7"/>
           </w:tcPr>
           <w:p>
             <w:r/>
@@ -567,7 +599,7 @@
         <w:rPr>
           <w:sz w:val="21"/>
         </w:rPr>
-        <w:t>A debt-free, dividend-paying recovery story riding a genuine semiconductor wafer-fab equipment upcycle, wrapped in an AI/clean-energy narrative that has roughly doubled the stock off its 52-week low — leaving valuation rich (~50–60x earnings) and trading above the lone published analyst target.</w:t>
+        <w:t>A debt-free, dividend-paying recovery story riding a genuine semiconductor wafer-fab equipment upcycle, wrapped in an AI / power-electronics narrative — reinforced by two May 2026 partnerships (Gotion BESS and NoMIS Power SiC) — that has roughly doubled the stock off its 52-week low, leaving valuation rich (~50–60x earnings) and trading above the lone published analyst target.</w:t>
       </w:r>
     </w:p>
     <w:p>
@@ -589,7 +621,7 @@
           <w:i w:val="0"/>
           <w:sz w:val="21"/>
         </w:rPr>
-        <w:t>PMT is re-accelerating (+14.5% ex-Healthcare in Q3 FY26) as semiconductor wafer-fab equipment demand recovers, fueled by AI-driven memory capex at its largest customer, Lam Research. Margins are expanding as the mix shifts toward proprietary engineered products. GES owns a real, patented wind-turbine ultracapacitor franchise (55,000+ modules installed; GE Vernova exclusivity) and is opening a new, potentially large adjacency in U.S.-made battery energy storage (Gotion partnership, May 2026). The balance sheet is pristine — no debt, ~$29.5M cash, 38 straight years of dividends — giving downside protection and optionality on the recovery.</w:t>
+        <w:t>PMT is re-accelerating (+14.5% ex-Healthcare in Q3 FY26) as semiconductor wafer-fab equipment demand recovers, fueled by AI-driven memory capex at its largest customer, Lam Research. Margins are expanding as the mix shifts toward proprietary engineered products. GES owns a real, patented wind-turbine ultracapacitor franchise (55,000+ modules installed; GE Vernova exclusivity) and is opening new adjacencies in U.S.-made battery energy storage (Gotion) and medium-/high-voltage silicon carbide for the power-electronics build-out (NoMIS, Navitas). The balance sheet is pristine — no debt, ~$29.5M cash, 38 straight years of dividends — giving downside protection and optionality on the recovery.</w:t>
       </w:r>
     </w:p>
     <w:p>
@@ -611,7 +643,7 @@
           <w:i w:val="0"/>
           <w:sz w:val="21"/>
         </w:rPr>
-        <w:t>The same wafer-fab end-market that is now the growth engine caused a 25% revenue collapse just two years ago — cyclicality is proven, not theoretical — and demand concentrates in one customer (Lam). The company is sub-scale with thin, lumpy margins (TTM net income only ~$0.2M) and recent quarters have dipped into losses. Valuation is stretched after a +70% AI-themed rally on ~$0.01 TTM EPS. Governance is a real concern: an 83-year-old founder-CEO controls ~63% of the vote via 10:1 super-voting shares, there is documented past related-party litigation, and capital-allocation history includes a multi-year, money-losing healthcare build-out that was sold in 2025 at a ~$4.9M loss.</w:t>
+        <w:t>The same wafer-fab end-market that is now the growth engine caused a 25% revenue collapse just two years ago — cyclicality is proven, not theoretical — and demand concentrates in one customer (Lam). The company is sub-scale with thin, lumpy margins (TTM net income only ~$0.2M) and recent quarters have dipped into losses. Valuation is stretched after a +70% AI-themed rally on ~$0.01 TTM EPS, and the new SiC/BESS deals are partnership announcements with no disclosed revenue. Governance is a real concern: an 83-year-old founder-CEO controls ~63% of the vote via 10:1 super-voting shares, there is documented past related-party litigation, and the capital-allocation history includes a multi-year, money-losing healthcare build-out sold in 2025 at a ~$4.9M loss.</w:t>
       </w:r>
     </w:p>
     <w:p>
@@ -633,7 +665,7 @@
           <w:i w:val="0"/>
           <w:sz w:val="21"/>
         </w:rPr>
-        <w:t>RELL is a high-quality, conservatively financed small-cap with a legitimate — but second-derivative and partial — exposure to the AI capex supercycle. The operational inflection is real and well-substantiated; the valuation already prices much of it in, and the most exciting "AI grid power / BESS" narrative is still optionality rather than booked revenue. It screens as a "buy-the-dip / own-the-cycle" name rather than a momentum chase at 52-week highs.</w:t>
+        <w:t>RELL is a high-quality, conservatively financed small-cap with a legitimate — but second-derivative and partial — exposure to the AI / power-electronics capex supercycle. The operational inflection is real and well-substantiated; the valuation already prices much of it in, and the most exciting "AI grid power / 800V / BESS" narratives are still optionality rather than booked revenue. It screens as a "buy-the-dip / own-the-cycle" name rather than a momentum chase at 52-week highs.</w:t>
       </w:r>
     </w:p>
     <w:p>
@@ -807,7 +839,7 @@
                 <w:b w:val="0"/>
                 <w:sz w:val="19"/>
               </w:rPr>
-              <w:t>Power-grid &amp; microwave tubes (legacy Electron Device Group), RF &amp; microwave components, semiconductor wafer-fab products/consumables, plus absorbed CT X-ray tube mfg/repair. The growth engine.</w:t>
+              <w:t>Power-grid &amp; microwave tubes (legacy Electron Device Group), RF &amp; microwave components, semiconductor wafer-fab products/consumables, SiC power-device distribution (Navitas, NoMIS), plus absorbed CT X-ray tube mfg/repair. The growth engine.</w:t>
             </w:r>
           </w:p>
         </w:tc>
@@ -1646,6 +1678,20 @@
     </w:p>
     <w:p>
       <w:pPr>
+        <w:pStyle w:val="ListBullet"/>
+      </w:pPr>
+      <w:r>
+        <w:rPr>
+          <w:b/>
+        </w:rPr>
+        <w:t xml:space="preserve">Greg Peloquin: </w:t>
+      </w:r>
+      <w:r>
+        <w:t>EVP &amp; GM of PMT and GES — the executive fronting the SiC (NoMIS/Navitas) and green-energy partnerships.</w:t>
+      </w:r>
+    </w:p>
+    <w:p>
+      <w:pPr>
         <w:pBdr>
           <w:bottom w:val="single" w:sz="6" w:space="4" w:color="1A5C97"/>
         </w:pBdr>
@@ -1822,6 +1868,20 @@
       </w:r>
     </w:p>
     <w:p>
+      <w:pPr>
+        <w:pStyle w:val="ListBullet"/>
+      </w:pPr>
+      <w:r>
+        <w:rPr>
+          <w:b/>
+        </w:rPr>
+        <w:t xml:space="preserve">New optionality: </w:t>
+      </w:r>
+      <w:r>
+        <w:t>Two May 2026 deals — Gotion (U.S.-made BESS) and NoMIS Power (medium-/high-voltage SiC) — open large new TAMs in grid storage and power electronics (detailed in Section 6.4).</w:t>
+      </w:r>
+    </w:p>
+    <w:p>
       <w:r>
         <w:rPr>
           <w:i/>
@@ -1870,7 +1930,7 @@
         <w:pStyle w:val="ListBullet"/>
       </w:pPr>
       <w:r>
-        <w:t>Debt-free, ~$29.5M net cash, 38-year dividend payer — meaningful downside protection for a microcap, and optionality on the GES/semiconductor recovery and BESS.</w:t>
+        <w:t>Debt-free, ~$29.5M net cash, 38-year dividend payer — meaningful downside protection for a microcap, and optionality on the GES/semiconductor recovery, BESS, and SiC power electronics.</w:t>
       </w:r>
     </w:p>
     <w:p>
@@ -1973,7 +2033,7 @@
         <w:pStyle w:val="ListBullet"/>
       </w:pPr>
       <w:r>
-        <w:t>As a distributor, success "depends in large part on maintaining current vendor relationships"; loss of a key franchise line is a stated risk. The broader distribution channel faces structural margin pressure from direct-to-customer and EMS/ODM trends.</w:t>
+        <w:t>As a distributor/integrator, success "depends in large part on maintaining current vendor relationships," and the deep IP in the new SiC/BESS deals sits with the partners (NoMIS, Navitas, Gotion), not RELL.</w:t>
       </w:r>
     </w:p>
     <w:p>
@@ -2028,7 +2088,7 @@
         <w:t xml:space="preserve">Precedent: </w:t>
       </w:r>
       <w:r>
-        <w:t>The multi-year Healthcare build-out (IMES acquisition, ALTA tubes) never reached sustained profitability and was sold in Jan 2025 at a ~$4.9M loss on disposal — a cautionary precedent for today's pre-profit bets.</w:t>
+        <w:t>The multi-year Healthcare build-out never reached sustained profitability and was sold in Jan 2025 at a ~$4.9M loss on disposal — a cautionary precedent for today's pre-profit bets.</w:t>
       </w:r>
     </w:p>
     <w:p>
@@ -2049,7 +2109,7 @@
         <w:pStyle w:val="ListBullet"/>
       </w:pPr>
       <w:r>
-        <w:t>Stock roughly doubled off its 52-week low (+~70% in the run) on the AI/data-center-power theme.</w:t>
+        <w:t>Stock roughly doubled off its 52-week low (+~70%) on the AI/data-center-power theme — the late-May leg was driven largely by the Gotion and NoMIS announcements.</w:t>
       </w:r>
     </w:p>
     <w:p>
@@ -2086,7 +2146,7 @@
         <w:pStyle w:val="ListBullet"/>
       </w:pPr>
       <w:r>
-        <w:t>No FX hedging (a 10% adverse move could "significantly" affect sales/assets); tariff/China-sourcing overhang (acknowledged but unquantified); inventory/supply-chain disruption; declining legacy vacuum-tube category.</w:t>
+        <w:t>No FX hedging; tariff/China-sourcing overhang (acute for the Gotion tie given U.S. political scrutiny of Chinese battery makers); inventory/supply-chain disruption; declining legacy vacuum-tube category.</w:t>
       </w:r>
     </w:p>
     <w:p>
@@ -2102,7 +2162,7 @@
           <w:color w:val="1F2A44"/>
           <w:sz w:val="32"/>
         </w:rPr>
-        <w:t>6.  The AI Secular Tailwind — How Real Is It?</w:t>
+        <w:t>6.  The AI / Power-Electronics Secular Tailwind — How Real Is It?</w:t>
       </w:r>
     </w:p>
     <w:p>
@@ -2111,7 +2171,7 @@
           <w:i/>
           <w:sz w:val="21"/>
         </w:rPr>
-        <w:t>This is the crux of the current narrative. Our assessment: RELL is a genuine but second-derivative, partial AI beneficiary — not a core AI play. The exposure can be sorted into three tiers of credibility.</w:t>
+        <w:t>This is the crux of the current narrative. Our assessment: RELL is a genuine but second-derivative, partial beneficiary — not a core AI play. The exposure sorts into three tiers of credibility, and two May 2026 partnerships (Section 6.4) nudge the data-center-power piece up the credibility ladder.</w:t>
       </w:r>
     </w:p>
     <w:p>
@@ -2149,24 +2209,10 @@
         <w:rPr>
           <w:b/>
         </w:rPr>
-        <w:t xml:space="preserve">The customer: </w:t>
+        <w:t xml:space="preserve">The customer &amp; size: </w:t>
       </w:r>
       <w:r>
-        <w:t>Lam Research is RELL's largest customer; Lam's FY2025 revenue grew ~24% to $18.4B on AI/memory (HBM/DRAM) capex. RELL rides that WFE cycle.</w:t>
-      </w:r>
-    </w:p>
-    <w:p>
-      <w:pPr>
-        <w:pStyle w:val="ListBullet"/>
-      </w:pPr>
-      <w:r>
-        <w:rPr>
-          <w:b/>
-        </w:rPr>
-        <w:t xml:space="preserve">Size: </w:t>
-      </w:r>
-      <w:r>
-        <w:t>Management guided this sub-business "north of $40M" for CY2025 — roughly 18–20% of total revenue — growing +52% YoY in Q1 FY26 with backlog support. This is the substantive, defensible AI thesis.</w:t>
+        <w:t>Lam Research is RELL's largest customer; Lam's FY2025 revenue grew ~24% to $18.4B on AI/memory (HBM/DRAM) capex. RELL rides that WFE cycle. Management guided this line "north of $40M" for CY2025 — ~18–20% of revenue — growing +52% YoY in Q1 FY26. This is the substantive, defensible AI thesis.</w:t>
       </w:r>
     </w:p>
     <w:p>
@@ -2202,7 +2248,7 @@
           <w:color w:val="1A5C97"/>
           <w:sz w:val="25"/>
         </w:rPr>
-        <w:t>Tier 2 — Indirect / overlapping (a few percent, hard to isolate)</w:t>
+        <w:t>Tier 2 — Indirect but increasingly concrete (the power-electronics / 800V angle)</w:t>
       </w:r>
     </w:p>
     <w:p>
@@ -2216,7 +2262,7 @@
         <w:t xml:space="preserve">SiC power devices: </w:t>
       </w:r>
       <w:r>
-        <w:t>RELL distributes Navitas/GeneSiC silicon-carbide power devices (650V–6,500V) whose stated target markets explicitly include "data center." Real but small, low-margin, and bundled into PMT.</w:t>
+        <w:t>RELL now distributes TWO complementary SiC lines — Navitas/GeneSiC (650V–6.5kV) and NoMIS Power (1.2kV–10kV, emphasis 3.3kV+). Both name "data center" / "AI data center power infrastructure" as target markets. See Section 6.3 on why the high-voltage band matters for the 800V transition.</w:t>
       </w:r>
     </w:p>
     <w:p>
@@ -2277,18 +2323,32 @@
         <w:rPr>
           <w:b/>
         </w:rPr>
-        <w:t xml:space="preserve">The "AI grid power / BESS" story: </w:t>
+        <w:t xml:space="preserve">Net: </w:t>
       </w:r>
       <w:r>
-        <w:t>GES is predominantly WIND-turbine pitch energy today, and recent multi-million-dollar contracts were with wind-farm operators, not data centers.</w:t>
+        <w:t>the AI/grid linkage for BESS is plausible (AI is the main driver of U.S. grid load growth) but currently investor-inferred. Neither the Gotion nor the Kane County BESS announcement explicitly names AI data centers, and there is NO disclosed data-center revenue or backlog. EUV-lithography exposure: none found.</w:t>
       </w:r>
     </w:p>
     <w:p>
       <w:pPr>
-        <w:pStyle w:val="ListBullet"/>
+        <w:spacing w:before="200" w:after="80"/>
       </w:pPr>
       <w:r>
-        <w:t>The $8.5M Kane County (IL) expansion (Aug 2025) and the Gotion U.S.-made BESS partnership (May 2026: a 760-kWh C&amp;I system and a 5 MWh utility-scale system) are framed around grid resilience and electricity costs — neither announcement explicitly names AI data centers, and there is NO disclosed data-center BESS revenue or backlog.</w:t>
+        <w:rPr>
+          <w:b/>
+          <w:color w:val="1A5C97"/>
+          <w:sz w:val="25"/>
+        </w:rPr>
+        <w:t>6.3  The 800V transition — RELL's silicon-carbide positioning</w:t>
+      </w:r>
+    </w:p>
+    <w:p>
+      <w:r>
+        <w:rPr>
+          <w:i w:val="0"/>
+          <w:sz w:val="21"/>
+        </w:rPr>
+        <w:t>A specific follow-on question: is RELL a beneficiary of the "800V transition"? Short answer — yes, directionally, but as a small second-order distributor riding others' silicon, with revenue weighted to 2027+.</w:t>
       </w:r>
     </w:p>
     <w:p>
@@ -2299,12 +2359,419 @@
         <w:rPr>
           <w:b/>
         </w:rPr>
-        <w:t xml:space="preserve">EUV exposure: none found. Net: </w:t>
+        <w:t xml:space="preserve">What it is: </w:t>
       </w:r>
       <w:r>
-        <w:t>the AI/grid linkage is investor-inferred, plausible (AI is the main driver of U.S. grid load growth), but currently optionality and execution-dependent — and the Gotion tie carries China-sourcing/policy risk.</w:t>
+        <w:t>NVIDIA's 800V HVDC data-center architecture (mass production targeted ~2027, Kyber/Rubin-era racks) strips out intermediate AC/DC conversion to feed 800V DC to 1MW+ racks. In that stack, SiC is the high-voltage "strongman" (rectifiers, solid-state transformers, HVDC interfaces) and GaN handles the fast low-voltage GPU rails. Named ecosystem partners: Infineon, Navitas, STMicro, TI, plus Eaton/Vertiv/Delta.</w:t>
       </w:r>
     </w:p>
+    <w:p>
+      <w:pPr>
+        <w:pStyle w:val="ListBullet"/>
+      </w:pPr>
+      <w:r>
+        <w:rPr>
+          <w:b/>
+        </w:rPr>
+        <w:t xml:space="preserve">Where RELL plugs in: </w:t>
+      </w:r>
+      <w:r>
+        <w:t>RELL distributes Navitas GeneSiC — and Navitas is itself one of NVIDIA's named 800V HVDC partners. The new NoMIS line (3.3kV+) sits exactly in the solid-state-transformer / HVDC-interface band. So the positioning is genuine, not just a tagline.</w:t>
+      </w:r>
+    </w:p>
+    <w:p>
+      <w:pPr>
+        <w:pStyle w:val="ListBullet"/>
+      </w:pPr>
+      <w:r>
+        <w:rPr>
+          <w:b/>
+        </w:rPr>
+        <w:t xml:space="preserve">Why it stays Tier 2: </w:t>
+      </w:r>
+      <w:r>
+        <w:t>RELL is a specialist distributor/integrator, not a chip maker — the marquee hyperscaler sockets are served direct by the chip makers and broadline giants (Arrow, Avnet, Mouser); RELL's lane is lower-volume, industrial and long-tail customers. It's a 2027+ story with no disclosed HVDC/data-center revenue yet, and the GaN (GPU-rail) content is thinner than the SiC content.</w:t>
+      </w:r>
+    </w:p>
+    <w:p>
+      <w:pPr>
+        <w:spacing w:before="200" w:after="80"/>
+      </w:pPr>
+      <w:r>
+        <w:rPr>
+          <w:b/>
+          <w:color w:val="1F2A44"/>
+          <w:sz w:val="25"/>
+        </w:rPr>
+        <w:t>6.4  Partnership spotlight — Gotion (May 13) and NoMIS Power (May 20, 2026)</w:t>
+      </w:r>
+    </w:p>
+    <w:p>
+      <w:r>
+        <w:rPr>
+          <w:i/>
+          <w:color w:val="555555"/>
+          <w:sz w:val="19"/>
+        </w:rPr>
+        <w:t>These two announcements, a week apart, drove the late-May rally and are the most tangible expressions of the AI/power-electronics and clean-energy theses. Both are partnership/technology deals with NO disclosed revenue, contract value, exclusivity terms, or volume commitments — treat them as on-strategy call options, not booked business.</w:t>
+      </w:r>
+    </w:p>
+    <w:tbl>
+      <w:tblPr>
+        <w:tblStyle w:val="TableGrid"/>
+        <w:tblW w:type="auto" w:w="0"/>
+        <w:jc w:val="center"/>
+        <w:tblLook w:firstColumn="1" w:firstRow="1" w:lastColumn="0" w:lastRow="0" w:noHBand="0" w:noVBand="1" w:val="04A0"/>
+      </w:tblPr>
+      <w:tblGrid>
+        <w:gridCol w:w="2880"/>
+        <w:gridCol w:w="2880"/>
+        <w:gridCol w:w="2880"/>
+      </w:tblGrid>
+      <w:tr>
+        <w:tc>
+          <w:tcPr>
+            <w:tcW w:type="dxa" w:w="1440"/>
+            <w:shd w:val="clear" w:color="auto" w:fill="1F2A44"/>
+          </w:tcPr>
+          <w:p>
+            <w:r/>
+            <w:r>
+              <w:rPr>
+                <w:b/>
+                <w:color w:val="FFFFFF"/>
+                <w:sz w:val="19"/>
+              </w:rPr>
+            </w:r>
+          </w:p>
+        </w:tc>
+        <w:tc>
+          <w:tcPr>
+            <w:tcW w:type="dxa" w:w="3960"/>
+            <w:shd w:val="clear" w:color="auto" w:fill="1F2A44"/>
+          </w:tcPr>
+          <w:p>
+            <w:r/>
+            <w:r>
+              <w:rPr>
+                <w:b/>
+                <w:color w:val="FFFFFF"/>
+                <w:sz w:val="19"/>
+              </w:rPr>
+              <w:t>Gotion — U.S.-made BESS</w:t>
+            </w:r>
+          </w:p>
+        </w:tc>
+        <w:tc>
+          <w:tcPr>
+            <w:tcW w:type="dxa" w:w="3960"/>
+            <w:shd w:val="clear" w:color="auto" w:fill="1F2A44"/>
+          </w:tcPr>
+          <w:p>
+            <w:r/>
+            <w:r>
+              <w:rPr>
+                <w:b/>
+                <w:color w:val="FFFFFF"/>
+                <w:sz w:val="19"/>
+              </w:rPr>
+              <w:t>NoMIS Power — silicon carbide</w:t>
+            </w:r>
+          </w:p>
+        </w:tc>
+      </w:tr>
+      <w:tr>
+        <w:tc>
+          <w:tcPr>
+            <w:tcW w:type="dxa" w:w="1440"/>
+          </w:tcPr>
+          <w:p>
+            <w:r/>
+            <w:r>
+              <w:rPr>
+                <w:b w:val="0"/>
+                <w:sz w:val="19"/>
+              </w:rPr>
+              <w:t>Announced</w:t>
+            </w:r>
+          </w:p>
+        </w:tc>
+        <w:tc>
+          <w:tcPr>
+            <w:tcW w:type="dxa" w:w="3960"/>
+          </w:tcPr>
+          <w:p>
+            <w:r/>
+            <w:r>
+              <w:rPr>
+                <w:b w:val="0"/>
+                <w:sz w:val="19"/>
+              </w:rPr>
+              <w:t>May 13, 2026</w:t>
+            </w:r>
+          </w:p>
+        </w:tc>
+        <w:tc>
+          <w:tcPr>
+            <w:tcW w:type="dxa" w:w="3960"/>
+          </w:tcPr>
+          <w:p>
+            <w:r/>
+            <w:r>
+              <w:rPr>
+                <w:b w:val="0"/>
+                <w:sz w:val="19"/>
+              </w:rPr>
+              <w:t>May 20, 2026</w:t>
+            </w:r>
+          </w:p>
+        </w:tc>
+      </w:tr>
+      <w:tr>
+        <w:tc>
+          <w:tcPr>
+            <w:tcW w:type="dxa" w:w="1440"/>
+            <w:shd w:val="clear" w:color="auto" w:fill="F0F3F7"/>
+          </w:tcPr>
+          <w:p>
+            <w:r/>
+            <w:r>
+              <w:rPr>
+                <w:b w:val="0"/>
+                <w:sz w:val="19"/>
+              </w:rPr>
+              <w:t>Partner</w:t>
+            </w:r>
+          </w:p>
+        </w:tc>
+        <w:tc>
+          <w:tcPr>
+            <w:tcW w:type="dxa" w:w="3960"/>
+            <w:shd w:val="clear" w:color="auto" w:fill="F0F3F7"/>
+          </w:tcPr>
+          <w:p>
+            <w:r/>
+            <w:r>
+              <w:rPr>
+                <w:b w:val="0"/>
+                <w:sz w:val="19"/>
+              </w:rPr>
+              <w:t>Gotion (Chinese-founded battery maker; U.S. arm). Cells/battery tech from its Manteno, IL hub.</w:t>
+            </w:r>
+          </w:p>
+        </w:tc>
+        <w:tc>
+          <w:tcPr>
+            <w:tcW w:type="dxa" w:w="3960"/>
+            <w:shd w:val="clear" w:color="auto" w:fill="F0F3F7"/>
+          </w:tcPr>
+          <w:p>
+            <w:r/>
+            <w:r>
+              <w:rPr>
+                <w:b w:val="0"/>
+                <w:sz w:val="19"/>
+              </w:rPr>
+              <w:t>NoMIS Power — designer of advanced SiC power semiconductors (planar MOSFETs, hybrid/bi-directional devices, diodes, modules).</w:t>
+            </w:r>
+          </w:p>
+        </w:tc>
+      </w:tr>
+      <w:tr>
+        <w:tc>
+          <w:tcPr>
+            <w:tcW w:type="dxa" w:w="1440"/>
+          </w:tcPr>
+          <w:p>
+            <w:r/>
+            <w:r>
+              <w:rPr>
+                <w:b w:val="0"/>
+                <w:sz w:val="19"/>
+              </w:rPr>
+              <w:t>Products</w:t>
+            </w:r>
+          </w:p>
+        </w:tc>
+        <w:tc>
+          <w:tcPr>
+            <w:tcW w:type="dxa" w:w="3960"/>
+          </w:tcPr>
+          <w:p>
+            <w:r/>
+            <w:r>
+              <w:rPr>
+                <w:b w:val="0"/>
+                <w:sz w:val="19"/>
+              </w:rPr>
+              <w:t>Two platforms: a 760-kWh C&amp;I system and a 5 MWh utility-scale system; scalable to projects in the hundreds of MW.</w:t>
+            </w:r>
+          </w:p>
+        </w:tc>
+        <w:tc>
+          <w:tcPr>
+            <w:tcW w:type="dxa" w:w="3960"/>
+          </w:tcPr>
+          <w:p>
+            <w:r/>
+            <w:r>
+              <w:rPr>
+                <w:b w:val="0"/>
+                <w:sz w:val="19"/>
+              </w:rPr>
+              <w:t>SiC across 1.2kV–10kV, emphasis on medium/high voltage 3.3kV+ for demanding power conversion.</w:t>
+            </w:r>
+          </w:p>
+        </w:tc>
+      </w:tr>
+      <w:tr>
+        <w:tc>
+          <w:tcPr>
+            <w:tcW w:type="dxa" w:w="1440"/>
+            <w:shd w:val="clear" w:color="auto" w:fill="F0F3F7"/>
+          </w:tcPr>
+          <w:p>
+            <w:r/>
+            <w:r>
+              <w:rPr>
+                <w:b w:val="0"/>
+                <w:sz w:val="19"/>
+              </w:rPr>
+              <w:t>RELL's role</w:t>
+            </w:r>
+          </w:p>
+        </w:tc>
+        <w:tc>
+          <w:tcPr>
+            <w:tcW w:type="dxa" w:w="3960"/>
+            <w:shd w:val="clear" w:color="auto" w:fill="F0F3F7"/>
+          </w:tcPr>
+          <w:p>
+            <w:r/>
+            <w:r>
+              <w:rPr>
+                <w:b w:val="0"/>
+                <w:sz w:val="19"/>
+              </w:rPr>
+              <w:t>Commercialization, engineering integration, and U.S. go-to-market; assembled in IL (Gotion Manteno; RELL La Fox capacity).</w:t>
+            </w:r>
+          </w:p>
+        </w:tc>
+        <w:tc>
+          <w:tcPr>
+            <w:tcW w:type="dxa" w:w="3960"/>
+            <w:shd w:val="clear" w:color="auto" w:fill="F0F3F7"/>
+          </w:tcPr>
+          <w:p>
+            <w:r/>
+            <w:r>
+              <w:rPr>
+                <w:b w:val="0"/>
+                <w:sz w:val="19"/>
+              </w:rPr>
+              <w:t>Global distribution + engineering integration; NoMIS brings device design, packaging, testing, reliability &amp; app support.</w:t>
+            </w:r>
+          </w:p>
+        </w:tc>
+      </w:tr>
+      <w:tr>
+        <w:tc>
+          <w:tcPr>
+            <w:tcW w:type="dxa" w:w="1440"/>
+          </w:tcPr>
+          <w:p>
+            <w:r/>
+            <w:r>
+              <w:rPr>
+                <w:b w:val="0"/>
+                <w:sz w:val="19"/>
+              </w:rPr>
+              <w:t>Target markets</w:t>
+            </w:r>
+          </w:p>
+        </w:tc>
+        <w:tc>
+          <w:tcPr>
+            <w:tcW w:type="dxa" w:w="3960"/>
+          </w:tcPr>
+          <w:p>
+            <w:r/>
+            <w:r>
+              <w:rPr>
+                <w:b w:val="0"/>
+                <w:sz w:val="19"/>
+              </w:rPr>
+              <w:t>C&amp;I and utility-scale grid storage; rising-electricity-cost mitigation, grid resilience. Tied to Illinois CRGA rebates (up to $250/kWh).</w:t>
+            </w:r>
+          </w:p>
+        </w:tc>
+        <w:tc>
+          <w:tcPr>
+            <w:tcW w:type="dxa" w:w="3960"/>
+          </w:tcPr>
+          <w:p>
+            <w:r/>
+            <w:r>
+              <w:rPr>
+                <w:b w:val="0"/>
+                <w:sz w:val="19"/>
+              </w:rPr>
+              <w:t>BESS, renewable conversion, AI data-center power, HVDC interfaces, solid-state transformers, rail, industrial drives, aerospace/defense, marine.</w:t>
+            </w:r>
+          </w:p>
+        </w:tc>
+      </w:tr>
+      <w:tr>
+        <w:tc>
+          <w:tcPr>
+            <w:tcW w:type="dxa" w:w="1440"/>
+            <w:shd w:val="clear" w:color="auto" w:fill="F0F3F7"/>
+          </w:tcPr>
+          <w:p>
+            <w:r/>
+            <w:r>
+              <w:rPr>
+                <w:b w:val="0"/>
+                <w:sz w:val="19"/>
+              </w:rPr>
+              <w:t>Strategic read</w:t>
+            </w:r>
+          </w:p>
+        </w:tc>
+        <w:tc>
+          <w:tcPr>
+            <w:tcW w:type="dxa" w:w="3960"/>
+            <w:shd w:val="clear" w:color="auto" w:fill="F0F3F7"/>
+          </w:tcPr>
+          <w:p>
+            <w:r/>
+            <w:r>
+              <w:rPr>
+                <w:b w:val="0"/>
+                <w:sz w:val="19"/>
+              </w:rPr>
+              <w:t>Domestic-content/tariff-insulated entry into a multi-billion-$ BESS market — but carries China-ownership political risk.</w:t>
+            </w:r>
+          </w:p>
+        </w:tc>
+        <w:tc>
+          <w:tcPr>
+            <w:tcW w:type="dxa" w:w="3960"/>
+            <w:shd w:val="clear" w:color="auto" w:fill="F0F3F7"/>
+          </w:tcPr>
+          <w:p>
+            <w:r/>
+            <w:r>
+              <w:rPr>
+                <w:b w:val="0"/>
+                <w:sz w:val="19"/>
+              </w:rPr>
+              <w:t>Extends SiC bench to ~650V–10kV (with Navitas); directly addresses the 800V/SST power build-out.</w:t>
+            </w:r>
+          </w:p>
+        </w:tc>
+      </w:tr>
+    </w:tbl>
     <w:p>
       <w:pPr>
         <w:spacing w:before="200" w:after="80"/>
@@ -2324,7 +2791,7 @@
           <w:i w:val="0"/>
           <w:sz w:val="21"/>
         </w:rPr>
-        <w:t>On the Q3 FY26 call (April 2026) management leaned into the theme — strength "driven by the semiconductor wafer fab market as AI continues to lift equipment demand globally," and customer forecasts suggesting "a longer upside cycle tied to broader semiconductor and data-center demand" into FY2027. The concrete, recurring claim is wafer-fab-via-Lam; the data-center/grid references are aspirational color.</w:t>
+        <w:t>On the Q3 FY26 call (April 2026) management leaned into the theme — strength "driven by the semiconductor wafer fab market as AI continues to lift equipment demand globally," with customer forecasts suggesting "a longer upside cycle tied to broader semiconductor and data-center demand" into FY2027. The concrete, recurring claim is wafer-fab-via-Lam; the data-center/grid references are aspirational color that the Gotion/NoMIS deals are beginning to give substance.</w:t>
       </w:r>
     </w:p>
     <w:p>
@@ -2358,7 +2825,7 @@
       <w:tr>
         <w:tc>
           <w:tcPr>
-            <w:tcW w:type="dxa" w:w="2448"/>
+            <w:tcW w:type="dxa" w:w="2232"/>
             <w:shd w:val="clear" w:color="auto" w:fill="1F2A44"/>
           </w:tcPr>
           <w:p>
@@ -2375,7 +2842,7 @@
         </w:tc>
         <w:tc>
           <w:tcPr>
-            <w:tcW w:type="dxa" w:w="2448"/>
+            <w:tcW w:type="dxa" w:w="2520"/>
             <w:shd w:val="clear" w:color="auto" w:fill="1F2A44"/>
           </w:tcPr>
           <w:p>
@@ -2392,7 +2859,7 @@
         </w:tc>
         <w:tc>
           <w:tcPr>
-            <w:tcW w:type="dxa" w:w="4464"/>
+            <w:tcW w:type="dxa" w:w="4608"/>
             <w:shd w:val="clear" w:color="auto" w:fill="1F2A44"/>
           </w:tcPr>
           <w:p>
@@ -2411,7 +2878,7 @@
       <w:tr>
         <w:tc>
           <w:tcPr>
-            <w:tcW w:type="dxa" w:w="2448"/>
+            <w:tcW w:type="dxa" w:w="2232"/>
           </w:tcPr>
           <w:p>
             <w:r/>
@@ -2426,7 +2893,7 @@
         </w:tc>
         <w:tc>
           <w:tcPr>
-            <w:tcW w:type="dxa" w:w="2448"/>
+            <w:tcW w:type="dxa" w:w="2520"/>
           </w:tcPr>
           <w:p>
             <w:r/>
@@ -2441,7 +2908,7 @@
         </w:tc>
         <w:tc>
           <w:tcPr>
-            <w:tcW w:type="dxa" w:w="4464"/>
+            <w:tcW w:type="dxa" w:w="4608"/>
           </w:tcPr>
           <w:p>
             <w:r/>
@@ -2458,8 +2925,57 @@
       <w:tr>
         <w:tc>
           <w:tcPr>
-            <w:tcW w:type="dxa" w:w="2448"/>
+            <w:tcW w:type="dxa" w:w="2232"/>
             <w:shd w:val="clear" w:color="auto" w:fill="F0F3F7"/>
+          </w:tcPr>
+          <w:p>
+            <w:r/>
+            <w:r>
+              <w:rPr>
+                <w:b w:val="0"/>
+                <w:sz w:val="19"/>
+              </w:rPr>
+              <w:t>NoMIS Power SiC partnership</w:t>
+            </w:r>
+          </w:p>
+        </w:tc>
+        <w:tc>
+          <w:tcPr>
+            <w:tcW w:type="dxa" w:w="2520"/>
+            <w:shd w:val="clear" w:color="auto" w:fill="F0F3F7"/>
+          </w:tcPr>
+          <w:p>
+            <w:r/>
+            <w:r>
+              <w:rPr>
+                <w:b w:val="0"/>
+                <w:sz w:val="19"/>
+              </w:rPr>
+              <w:t>Announced May 20, 2026; PCIM Europe debut Jun 9–11, 2026</w:t>
+            </w:r>
+          </w:p>
+        </w:tc>
+        <w:tc>
+          <w:tcPr>
+            <w:tcW w:type="dxa" w:w="4608"/>
+            <w:shd w:val="clear" w:color="auto" w:fill="F0F3F7"/>
+          </w:tcPr>
+          <w:p>
+            <w:r/>
+            <w:r>
+              <w:rPr>
+                <w:b w:val="0"/>
+                <w:sz w:val="19"/>
+              </w:rPr>
+              <w:t>Medium/high-voltage (3.3kV+) SiC aimed at AI data-center power, HVDC interfaces and solid-state transformers — the 800V build-out. Watch for design wins / first revenue.</w:t>
+            </w:r>
+          </w:p>
+        </w:tc>
+      </w:tr>
+      <w:tr>
+        <w:tc>
+          <w:tcPr>
+            <w:tcW w:type="dxa" w:w="2232"/>
           </w:tcPr>
           <w:p>
             <w:r/>
@@ -2474,8 +2990,7 @@
         </w:tc>
         <w:tc>
           <w:tcPr>
-            <w:tcW w:type="dxa" w:w="2448"/>
-            <w:shd w:val="clear" w:color="auto" w:fill="F0F3F7"/>
+            <w:tcW w:type="dxa" w:w="2520"/>
           </w:tcPr>
           <w:p>
             <w:r/>
@@ -2490,8 +3005,7 @@
         </w:tc>
         <w:tc>
           <w:tcPr>
-            <w:tcW w:type="dxa" w:w="4464"/>
-            <w:shd w:val="clear" w:color="auto" w:fill="F0F3F7"/>
+            <w:tcW w:type="dxa" w:w="4608"/>
           </w:tcPr>
           <w:p>
             <w:r/>
@@ -2500,7 +3014,7 @@
                 <w:b w:val="0"/>
                 <w:sz w:val="19"/>
               </w:rPr>
-              <w:t>U.S.-manufactured 760-kWh and 5 MWh battery storage systems for a "multi-billion-dollar" market. Highest-optionality catalyst — but no disclosed contract value yet.</w:t>
+              <w:t>U.S.-made 760-kWh and 5 MWh storage systems for a "multi-billion-dollar" market, IL CRGA-subsidized. Highest-optionality catalyst — but no disclosed contract value, and China-ownership political risk.</w:t>
             </w:r>
           </w:p>
         </w:tc>
@@ -2508,7 +3022,8 @@
       <w:tr>
         <w:tc>
           <w:tcPr>
-            <w:tcW w:type="dxa" w:w="2448"/>
+            <w:tcW w:type="dxa" w:w="2232"/>
+            <w:shd w:val="clear" w:color="auto" w:fill="F0F3F7"/>
           </w:tcPr>
           <w:p>
             <w:r/>
@@ -2523,7 +3038,8 @@
         </w:tc>
         <w:tc>
           <w:tcPr>
-            <w:tcW w:type="dxa" w:w="2448"/>
+            <w:tcW w:type="dxa" w:w="2520"/>
+            <w:shd w:val="clear" w:color="auto" w:fill="F0F3F7"/>
           </w:tcPr>
           <w:p>
             <w:r/>
@@ -2538,7 +3054,8 @@
         </w:tc>
         <w:tc>
           <w:tcPr>
-            <w:tcW w:type="dxa" w:w="4464"/>
+            <w:tcW w:type="dxa" w:w="4608"/>
+            <w:shd w:val="clear" w:color="auto" w:fill="F0F3F7"/>
           </w:tcPr>
           <w:p>
             <w:r/>
@@ -2555,8 +3072,7 @@
       <w:tr>
         <w:tc>
           <w:tcPr>
-            <w:tcW w:type="dxa" w:w="2448"/>
-            <w:shd w:val="clear" w:color="auto" w:fill="F0F3F7"/>
+            <w:tcW w:type="dxa" w:w="2232"/>
           </w:tcPr>
           <w:p>
             <w:r/>
@@ -2571,8 +3087,7 @@
         </w:tc>
         <w:tc>
           <w:tcPr>
-            <w:tcW w:type="dxa" w:w="2448"/>
-            <w:shd w:val="clear" w:color="auto" w:fill="F0F3F7"/>
+            <w:tcW w:type="dxa" w:w="2520"/>
           </w:tcPr>
           <w:p>
             <w:r/>
@@ -2587,8 +3102,7 @@
         </w:tc>
         <w:tc>
           <w:tcPr>
-            <w:tcW w:type="dxa" w:w="4464"/>
-            <w:shd w:val="clear" w:color="auto" w:fill="F0F3F7"/>
+            <w:tcW w:type="dxa" w:w="4608"/>
           </w:tcPr>
           <w:p>
             <w:r/>
@@ -2605,7 +3119,8 @@
       <w:tr>
         <w:tc>
           <w:tcPr>
-            <w:tcW w:type="dxa" w:w="2448"/>
+            <w:tcW w:type="dxa" w:w="2232"/>
+            <w:shd w:val="clear" w:color="auto" w:fill="F0F3F7"/>
           </w:tcPr>
           <w:p>
             <w:r/>
@@ -2620,7 +3135,8 @@
         </w:tc>
         <w:tc>
           <w:tcPr>
-            <w:tcW w:type="dxa" w:w="2448"/>
+            <w:tcW w:type="dxa" w:w="2520"/>
+            <w:shd w:val="clear" w:color="auto" w:fill="F0F3F7"/>
           </w:tcPr>
           <w:p>
             <w:r/>
@@ -2635,7 +3151,8 @@
         </w:tc>
         <w:tc>
           <w:tcPr>
-            <w:tcW w:type="dxa" w:w="4464"/>
+            <w:tcW w:type="dxa" w:w="4608"/>
+            <w:shd w:val="clear" w:color="auto" w:fill="F0F3F7"/>
           </w:tcPr>
           <w:p>
             <w:r/>
@@ -2652,8 +3169,7 @@
       <w:tr>
         <w:tc>
           <w:tcPr>
-            <w:tcW w:type="dxa" w:w="2448"/>
-            <w:shd w:val="clear" w:color="auto" w:fill="F0F3F7"/>
+            <w:tcW w:type="dxa" w:w="2232"/>
           </w:tcPr>
           <w:p>
             <w:r/>
@@ -2668,8 +3184,7 @@
         </w:tc>
         <w:tc>
           <w:tcPr>
-            <w:tcW w:type="dxa" w:w="2448"/>
-            <w:shd w:val="clear" w:color="auto" w:fill="F0F3F7"/>
+            <w:tcW w:type="dxa" w:w="2520"/>
           </w:tcPr>
           <w:p>
             <w:r/>
@@ -2684,8 +3199,7 @@
         </w:tc>
         <w:tc>
           <w:tcPr>
-            <w:tcW w:type="dxa" w:w="4464"/>
-            <w:shd w:val="clear" w:color="auto" w:fill="F0F3F7"/>
+            <w:tcW w:type="dxa" w:w="4608"/>
           </w:tcPr>
           <w:p>
             <w:r/>
@@ -2707,7 +3221,7 @@
           <w:color w:val="555555"/>
           <w:sz w:val="19"/>
         </w:rPr>
-        <w:t>Calendar watch-items: (1) ~late July — FY26 print + FY27 guide; (2) 2H-2026 — Gotion BESS commercial ramp and La Fox capacity online; (3) ongoing — PMT/semi orders tracking the SEMI 2026–2027 WFE upcycle.</w:t>
+        <w:t>Calendar watch-items: (1) ~late July — FY26 print + FY27 guide; (2) Jun 9–11 — NoMIS/PCIM Europe; (3) 2H-2026 — Gotion BESS commercial ramp and La Fox capacity online; (4) ongoing — PMT/semi orders tracking the SEMI 2026–2027 WFE upcycle.</w:t>
       </w:r>
     </w:p>
     <w:p>
@@ -2948,7 +3462,7 @@
                 <w:b w:val="0"/>
                 <w:sz w:val="19"/>
               </w:rPr>
-              <w:t>AI exposure</w:t>
+              <w:t>AI / power exposure</w:t>
             </w:r>
           </w:p>
         </w:tc>
@@ -2964,7 +3478,7 @@
                 <w:b w:val="0"/>
                 <w:sz w:val="19"/>
               </w:rPr>
-              <w:t>~18–20% rev genuinely WFE/AI-levered + BESS optionality</w:t>
+              <w:t>~18–20% rev WFE/AI-levered + SiC (800V) + BESS optionality</w:t>
             </w:r>
           </w:p>
         </w:tc>
@@ -2980,7 +3494,7 @@
                 <w:b w:val="0"/>
                 <w:sz w:val="19"/>
               </w:rPr>
-              <w:t>Second-derivative feeder; grid/BESS is narrative, not revenue</w:t>
+              <w:t>Second-derivative feeder; SiC/BESS deals = no disclosed revenue</w:t>
             </w:r>
           </w:p>
         </w:tc>
@@ -3109,7 +3623,7 @@
         <w:pStyle w:val="ListBullet"/>
       </w:pPr>
       <w:r>
-        <w:t>Gotion BESS converts to a disclosed multi-year revenue/backlog contract; GES margin scales.</w:t>
+        <w:t>Gotion BESS and NoMIS SiC convert to disclosed multi-year revenue/backlog; GES margin scales.</w:t>
       </w:r>
     </w:p>
     <w:p>
@@ -3146,7 +3660,7 @@
         <w:pStyle w:val="ListBullet"/>
       </w:pPr>
       <w:r>
-        <w:t>BESS/Gotion stalls (China-sourcing/policy friction) and remains a press release rather than revenue.</w:t>
+        <w:t>BESS/Gotion stalls (China-ownership policy friction) and the SiC deals stay press releases rather than revenue.</w:t>
       </w:r>
     </w:p>
     <w:p>
@@ -3193,7 +3707,7 @@
         <w:rPr>
           <w:sz w:val="21"/>
         </w:rPr>
-        <w:t>This report synthesizes web-search extracts of primary sources (SEC 8-K/10-Q/10-K, GlobeNewswire press releases, earnings-call transcripts, and financial aggregators). Direct page-fetching of SEC.gov, GlobeNewswire, StockTitan and similar was blocked (HTTP 403) during research, so dollar figures were corroborated across multiple secondary extracts rather than read line-by-line from filings. Treat management TAM figures (e.g., ~$454M wind PEM TAM, ~$43M cumulative wind sales) as company-presented and directional. Confirm exact full-year GAAP EPS, segment percentages, and the FY26 Q4 earnings date against the primary filings before acting.</w:t>
+        <w:t>This report synthesizes web-search extracts of primary sources (SEC 8-K/10-Q/10-K, GlobeNewswire press releases, earnings-call transcripts, and financial aggregators). Direct page-fetching of SEC.gov, GlobeNewswire, StockTitan and similar was blocked (HTTP 403) during research, so dollar figures were corroborated across multiple secondary extracts rather than read line-by-line from filings. Treat management TAM figures and the un-quantified May 2026 partnerships as company-presented/optionality. Confirm exact full-year GAAP EPS, segment percentages, and the FY26 Q4 earnings date against the primary filings before acting.</w:t>
       </w:r>
     </w:p>
     <w:p>
@@ -3239,7 +3753,7 @@
         <w:rPr>
           <w:sz w:val="18"/>
         </w:rPr>
-        <w:t>Q3 FY26 results press release (Apr 8, 2026) — globenewswire.com (Richardson Electronics Reports Third Quarter Results)</w:t>
+        <w:t>Q3 FY26 results press release (Apr 8, 2026) — globenewswire.com</w:t>
       </w:r>
     </w:p>
     <w:p>
@@ -3294,7 +3808,18 @@
         <w:rPr>
           <w:sz w:val="18"/>
         </w:rPr>
-        <w:t>Gotion BESS technology partnership (May 13, 2026) — globenewswire.com / energy-storage.news</w:t>
+        <w:t>NoMIS Power SiC technology partnership (May 20, 2026) — globenewswire.com; signalintegrityjournal.com; investing.com</w:t>
+      </w:r>
+    </w:p>
+    <w:p>
+      <w:pPr>
+        <w:pStyle w:val="ListBullet"/>
+      </w:pPr>
+      <w:r>
+        <w:rPr>
+          <w:sz w:val="18"/>
+        </w:rPr>
+        <w:t>Gotion BESS technology partnership (May 13, 2026) — globenewswire.com; energy-storage.news; solarpowerworldonline.com</w:t>
       </w:r>
     </w:p>
     <w:p>
@@ -3316,7 +3841,18 @@
         <w:rPr>
           <w:sz w:val="18"/>
         </w:rPr>
-        <w:t>Navitas/GeneSiC SiC partnership EMEA expansion (Nov 12, 2024) — globenewswire.com</w:t>
+        <w:t>Navitas/GeneSiC SiC partnership EMEA expansion (Nov 12, 2024) — globenewswire.com; navitassemi.com</w:t>
+      </w:r>
+    </w:p>
+    <w:p>
+      <w:pPr>
+        <w:pStyle w:val="ListBullet"/>
+      </w:pPr>
+      <w:r>
+        <w:rPr>
+          <w:sz w:val="18"/>
+        </w:rPr>
+        <w:t>NVIDIA 800V HVDC architecture &amp; ecosystem — navitassemi.com; powerelectronicsnews.com; semianalysis.com</w:t>
       </w:r>
     </w:p>
     <w:p>

</xml_diff>